<commit_message>
Add Leng Sovannadara as new team member to proposals
- Added Member 4 (Leng Sovannadara) to the proposal template team table
- Added Team member 3 (Leng Sovannadara) to the research proposal team table
- Ignore Word temp/lock files in .gitignore

Co-Authored-By: Claude Sonnet 4.6 <noreply@anthropic.com>
Claude-Session: https://claude.ai/code/session_01Pn1w6kAVBmVcnmyCN4Td2u
</commit_message>
<xml_diff>
--- a/ITM-360-Artificial-Intelligence(AI)-Proposal-Format.docx
+++ b/ITM-360-Artificial-Intelligence(AI)-Proposal-Format.docx
@@ -849,6 +849,88 @@
                 <w:lang w:val="en-US"/>
               </w:rPr>
             </w:pPr>
+          </w:p>
+        </w:tc>
+        <w:tc>
+          <w:tcPr>
+            <w:tcW w:w="2510" w:type="dxa"/>
+            <w:vAlign w:val="center"/>
+          </w:tcPr>
+          <w:p>
+            <w:pPr>
+              <w:jc w:val="center"/>
+              <w:rPr>
+                <w:rFonts w:ascii="Times New Roman" w:hAnsi="Times New Roman" w:cs="Times New Roman"/>
+                <w:lang w:val="en-US"/>
+              </w:rPr>
+            </w:pPr>
+            <w:r>
+              <w:rPr>
+                <w:rFonts w:ascii="Times New Roman" w:hAnsi="Times New Roman" w:cs="Times New Roman"/>
+                <w:lang w:val="en-US"/>
+              </w:rPr>
+              <w:t>Student ID</w:t>
+            </w:r>
+          </w:p>
+        </w:tc>
+        <w:tc>
+          <w:tcPr>
+            <w:tcW w:w="2818" w:type="dxa"/>
+            <w:vAlign w:val="center"/>
+          </w:tcPr>
+          <w:p>
+            <w:pPr>
+              <w:jc w:val="center"/>
+              <w:rPr>
+                <w:rFonts w:ascii="Times New Roman" w:hAnsi="Times New Roman" w:cs="Times New Roman"/>
+                <w:lang w:val="en-US"/>
+              </w:rPr>
+            </w:pPr>
+          </w:p>
+        </w:tc>
+      </w:tr>
+      <w:tr>
+        <w:trPr>
+          <w:trHeight w:val="784"/>
+        </w:trPr>
+        <w:tc>
+          <w:tcPr>
+            <w:tcW w:w="1967" w:type="dxa"/>
+            <w:vAlign w:val="center"/>
+          </w:tcPr>
+          <w:p>
+            <w:pPr>
+              <w:jc w:val="center"/>
+              <w:rPr>
+                <w:rFonts w:ascii="Times New Roman" w:hAnsi="Times New Roman" w:cs="Times New Roman"/>
+                <w:lang w:val="en-US"/>
+              </w:rPr>
+            </w:pPr>
+            <w:r>
+              <w:rPr>
+                <w:rFonts w:ascii="Times New Roman" w:hAnsi="Times New Roman" w:cs="Times New Roman"/>
+                <w:lang w:val="en-US"/>
+              </w:rPr>
+              <w:t>Member 4</w:t>
+            </w:r>
+          </w:p>
+        </w:tc>
+        <w:tc>
+          <w:tcPr>
+            <w:tcW w:w="1997" w:type="dxa"/>
+            <w:vAlign w:val="center"/>
+          </w:tcPr>
+          <w:p>
+            <w:pPr>
+              <w:jc w:val="center"/>
+              <w:rPr>
+                <w:rFonts w:ascii="Times New Roman" w:hAnsi="Times New Roman" w:cs="Times New Roman"/>
+                <w:lang w:val="en-US"/>
+              </w:rPr>
+            </w:pPr>
+            <w:r>
+              <w:t>Leng Sovannadara</w:t>
+            </w:r>
           </w:p>
         </w:tc>
         <w:tc>

</xml_diff>